<commit_message>
Completes animals.py assignment, 4-2.
</commit_message>
<xml_diff>
--- a/assignments/1.2. Hello World.docx
+++ b/assignments/1.2. Hello World.docx
@@ -9,6 +9,9 @@
     </w:p>
     <w:p>
       <w:r>
+        <w:rPr>
+          <w:noProof/>
+        </w:rPr>
         <w:drawing>
           <wp:inline distT="0" distB="0" distL="0" distR="0" wp14:anchorId="29CFAF1E" wp14:editId="58A348A5">
             <wp:extent cx="8229600" cy="1866265"/>
@@ -66,6 +69,9 @@
     </w:p>
     <w:p>
       <w:r>
+        <w:rPr>
+          <w:noProof/>
+        </w:rPr>
         <w:drawing>
           <wp:inline distT="0" distB="0" distL="0" distR="0" wp14:anchorId="01A4588A" wp14:editId="7431710B">
             <wp:extent cx="8229600" cy="1678940"/>
@@ -104,8 +110,15 @@
       </w:r>
     </w:p>
     <w:p>
+      <w:pPr>
+        <w:pStyle w:val="ListParagraph"/>
+        <w:numPr>
+          <w:ilvl w:val="0"/>
+          <w:numId w:val="1"/>
+        </w:numPr>
+      </w:pPr>
       <w:r>
-        <w:tab/>
+        <w:t xml:space="preserve">The typo is within the message itself, but Python doesn’t check for that. The syntax is accurate and correct, so no error message is generated. </w:t>
       </w:r>
     </w:p>
     <w:sectPr>

</xml_diff>